<commit_message>
Fix Com4 header to include NC and BM logos
Rebuilt Com4 using Com1 as template base to correctly inherit the NC logo (inline) and BM logo (floating anchor) header layout.

Co-Authored-By: Claude Sonnet 4.6 <noreply@anthropic.com>
</commit_message>
<xml_diff>
--- a/Standard Operating Procedures/Com4 Role Email Address Setup.docx
+++ b/Standard Operating Procedures/Com4 Role Email Address Setup.docx
@@ -2,6 +2,101 @@
 <file path=word/document.xml><?xml version="1.0" encoding="utf-8"?>
 <w:document xmlns:wpc="http://schemas.microsoft.com/office/word/2010/wordprocessingCanvas" xmlns:mo="http://schemas.microsoft.com/office/mac/office/2008/main" xmlns:mc="http://schemas.openxmlformats.org/markup-compatibility/2006" xmlns:mv="urn:schemas-microsoft-com:mac:vml" xmlns:o="urn:schemas-microsoft-com:office:office" xmlns:r="http://schemas.openxmlformats.org/officeDocument/2006/relationships" xmlns:m="http://schemas.openxmlformats.org/officeDocument/2006/math" xmlns:v="urn:schemas-microsoft-com:vml" xmlns:wp14="http://schemas.microsoft.com/office/word/2010/wordprocessingDrawing" xmlns:wp="http://schemas.openxmlformats.org/drawingml/2006/wordprocessingDrawing" xmlns:w10="urn:schemas-microsoft-com:office:word" xmlns:w="http://schemas.openxmlformats.org/wordprocessingml/2006/main" xmlns:w14="http://schemas.microsoft.com/office/word/2010/wordml" xmlns:wpg="http://schemas.microsoft.com/office/word/2010/wordprocessingGroup" xmlns:wpi="http://schemas.microsoft.com/office/word/2010/wordprocessingInk" xmlns:wne="http://schemas.microsoft.com/office/word/2006/wordml" xmlns:wps="http://schemas.microsoft.com/office/word/2010/wordprocessingShape" mc:Ignorable="w14 wp14">
   <w:body>
+    <w:p>
+      <w:pPr>
+        <w:jc w:val="left"/>
+      </w:pPr>
+      <w:r>
+        <w:drawing>
+          <wp:inline xmlns:a="http://schemas.openxmlformats.org/drawingml/2006/main" xmlns:pic="http://schemas.openxmlformats.org/drawingml/2006/picture">
+            <wp:extent cx="2879860" cy="822960"/>
+            <wp:docPr id="1" name="Picture 1"/>
+            <wp:cNvGraphicFramePr>
+              <a:graphicFrameLocks noChangeAspect="1"/>
+            </wp:cNvGraphicFramePr>
+            <a:graphic>
+              <a:graphicData uri="http://schemas.openxmlformats.org/drawingml/2006/picture">
+                <pic:pic>
+                  <pic:nvPicPr>
+                    <pic:cNvPr id="0" name="NC logo.png"/>
+                    <pic:cNvPicPr/>
+                  </pic:nvPicPr>
+                  <pic:blipFill>
+                    <a:blip r:embed="rId9"/>
+                    <a:stretch>
+                      <a:fillRect/>
+                    </a:stretch>
+                  </pic:blipFill>
+                  <pic:spPr>
+                    <a:xfrm>
+                      <a:off x="0" y="0"/>
+                      <a:ext cx="2879860" cy="822960"/>
+                    </a:xfrm>
+                    <a:prstGeom prst="rect"/>
+                  </pic:spPr>
+                </pic:pic>
+              </a:graphicData>
+            </a:graphic>
+          </wp:inline>
+        </w:drawing>
+      </w:r>
+      <w:r>
+        <w:drawing>
+          <wp:anchor xmlns:a="http://schemas.openxmlformats.org/drawingml/2006/main" xmlns:pic="http://schemas.openxmlformats.org/drawingml/2006/picture" distT="0" distB="0" distL="0" distR="0" simplePos="0" relativeHeight="3" behindDoc="0" locked="0" layoutInCell="0" allowOverlap="1">
+            <wp:simplePos x="0" y="0"/>
+            <wp:positionH relativeFrom="column">
+              <wp:posOffset>4833620</wp:posOffset>
+            </wp:positionH>
+            <wp:positionV relativeFrom="paragraph">
+              <wp:posOffset>-123825</wp:posOffset>
+            </wp:positionV>
+            <wp:extent cx="1529080" cy="1091565"/>
+            <wp:effectExtent l="0" t="0" r="0" b="0"/>
+            <wp:wrapSquare wrapText="largest"/>
+            <wp:docPr id="2" name="BMlogo"/>
+            <wp:cNvGraphicFramePr>
+              <a:graphicFrameLocks noChangeAspect="1"/>
+            </wp:cNvGraphicFramePr>
+            <a:graphic>
+              <a:graphicData uri="http://schemas.openxmlformats.org/drawingml/2006/picture">
+                <pic:pic>
+                  <pic:nvPicPr>
+                    <pic:cNvPr id="2" name="BMlogo"/>
+                    <pic:cNvPicPr>
+                      <a:picLocks noChangeAspect="1" noChangeArrowheads="1"/>
+                    </pic:cNvPicPr>
+                  </pic:nvPicPr>
+                  <pic:blipFill>
+                    <a:blip r:embed="rId10"/>
+                    <a:stretch>
+                      <a:fillRect/>
+                    </a:stretch>
+                  </pic:blipFill>
+                  <pic:spPr bwMode="auto">
+                    <a:xfrm>
+                      <a:off x="0" y="0"/>
+                      <a:ext cx="1529080" cy="1091565"/>
+                    </a:xfrm>
+                    <a:prstGeom prst="rect">
+                      <a:avLst/>
+                    </a:prstGeom>
+                    <a:noFill/>
+                  </pic:spPr>
+                </pic:pic>
+              </a:graphicData>
+            </a:graphic>
+          </wp:anchor>
+        </w:drawing>
+      </w:r>
+    </w:p>
+    <w:p/>
+    <w:p>
+      <w:pPr>
+        <w:pBdr>
+          <w:bottom w:val="single" w:sz="12" w:space="1" w:color="000000"/>
+        </w:pBdr>
+      </w:pPr>
+    </w:p>
     <w:p>
       <w:pPr>
         <w:jc w:val="center"/>
@@ -9,6 +104,8 @@
       <w:r>
         <w:rPr>
           <w:b/>
+          <w:i w:val="0"/>
+          <w:sz w:val="22"/>
         </w:rPr>
         <w:t>STANDARD OPERATING PROCEDURE</w:t>
       </w:r>
@@ -20,10 +117,13 @@
       <w:r>
         <w:rPr>
           <w:b/>
+          <w:i w:val="0"/>
+          <w:sz w:val="30"/>
         </w:rPr>
         <w:t>Role Email Address Setup</w:t>
       </w:r>
     </w:p>
+    <w:p/>
     <w:tbl>
       <w:tblPr>
         <w:tblStyle w:val="TableGrid"/>
@@ -31,13 +131,13 @@
         <w:tblLook w:firstColumn="1" w:firstRow="1" w:lastColumn="0" w:lastRow="0" w:noHBand="0" w:noVBand="1" w:val="04A0"/>
       </w:tblPr>
       <w:tblGrid>
-        <w:gridCol w:w="4320"/>
-        <w:gridCol w:w="4320"/>
+        <w:gridCol w:w="4680"/>
+        <w:gridCol w:w="4680"/>
       </w:tblGrid>
       <w:tr>
         <w:tc>
           <w:tcPr>
-            <w:tcW w:type="dxa" w:w="4320"/>
+            <w:tcW w:type="dxa" w:w="4680"/>
           </w:tcPr>
           <w:p>
             <w:r>
@@ -47,7 +147,7 @@
         </w:tc>
         <w:tc>
           <w:tcPr>
-            <w:tcW w:type="dxa" w:w="4320"/>
+            <w:tcW w:type="dxa" w:w="4680"/>
           </w:tcPr>
           <w:p>
             <w:r>
@@ -59,7 +159,7 @@
       <w:tr>
         <w:tc>
           <w:tcPr>
-            <w:tcW w:type="dxa" w:w="4320"/>
+            <w:tcW w:type="dxa" w:w="4680"/>
           </w:tcPr>
           <w:p>
             <w:r>
@@ -69,7 +169,7 @@
         </w:tc>
         <w:tc>
           <w:tcPr>
-            <w:tcW w:type="dxa" w:w="4320"/>
+            <w:tcW w:type="dxa" w:w="4680"/>
           </w:tcPr>
           <w:p>
             <w:r>
@@ -81,7 +181,7 @@
       <w:tr>
         <w:tc>
           <w:tcPr>
-            <w:tcW w:type="dxa" w:w="4320"/>
+            <w:tcW w:type="dxa" w:w="4680"/>
           </w:tcPr>
           <w:p>
             <w:r>
@@ -91,7 +191,7 @@
         </w:tc>
         <w:tc>
           <w:tcPr>
-            <w:tcW w:type="dxa" w:w="4320"/>
+            <w:tcW w:type="dxa" w:w="4680"/>
           </w:tcPr>
           <w:p>
             <w:r>
@@ -103,7 +203,7 @@
       <w:tr>
         <w:tc>
           <w:tcPr>
-            <w:tcW w:type="dxa" w:w="4320"/>
+            <w:tcW w:type="dxa" w:w="4680"/>
           </w:tcPr>
           <w:p>
             <w:r>
@@ -113,7 +213,7 @@
         </w:tc>
         <w:tc>
           <w:tcPr>
-            <w:tcW w:type="dxa" w:w="4320"/>
+            <w:tcW w:type="dxa" w:w="4680"/>
           </w:tcPr>
           <w:p>
             <w:r>
@@ -287,7 +387,7 @@
     </w:p>
     <w:p>
       <w:r>
-        <w:t>10. Gmail will send a verification email to the new address. Because the Cloudflare routing rule is now active, this email will arrive in the camp Gmail inbox (tagged nipcrime+[role]).</w:t>
+        <w:t>10. Gmail will send a verification email to the new address. Because the Cloudflare routing rule is now active, this email will arrive in the camp Gmail inbox.</w:t>
       </w:r>
     </w:p>
     <w:p>
@@ -411,13 +511,34 @@
       </w:r>
     </w:p>
     <w:sectPr>
+      <w:footerReference w:type="default" r:id="rId11"/>
       <w:pgSz w:w="12240" w:h="15840"/>
-      <w:pgMar w:top="1440" w:right="1800" w:bottom="1440" w:left="1800" w:header="720" w:footer="720" w:gutter="0"/>
+      <w:pgMar w:top="720" w:right="1440" w:bottom="1080" w:left="1440" w:header="720" w:footer="720" w:gutter="0"/>
       <w:cols w:space="720"/>
       <w:docGrid w:linePitch="360"/>
     </w:sectPr>
   </w:body>
 </w:document>
+</file>
+
+<file path=word/footer1.xml><?xml version="1.0" encoding="utf-8"?>
+<w:ftr xmlns:m="http://schemas.openxmlformats.org/officeDocument/2006/math" xmlns:mc="http://schemas.openxmlformats.org/markup-compatibility/2006" xmlns:mo="http://schemas.microsoft.com/office/mac/office/2008/main" xmlns:mv="urn:schemas-microsoft-com:mac:vml" xmlns:o="urn:schemas-microsoft-com:office:office" xmlns:r="http://schemas.openxmlformats.org/officeDocument/2006/relationships" xmlns:v="urn:schemas-microsoft-com:vml" xmlns:w10="urn:schemas-microsoft-com:office:word" xmlns:w14="http://schemas.microsoft.com/office/word/2010/wordml" xmlns:w="http://schemas.openxmlformats.org/wordprocessingml/2006/main" xmlns:wne="http://schemas.microsoft.com/office/word/2006/wordml" xmlns:wp14="http://schemas.microsoft.com/office/word/2010/wordprocessingDrawing" xmlns:wp="http://schemas.openxmlformats.org/drawingml/2006/wordprocessingDrawing" xmlns:wpc="http://schemas.microsoft.com/office/word/2010/wordprocessingCanvas" xmlns:wpg="http://schemas.microsoft.com/office/word/2010/wordprocessingGroup" xmlns:wpi="http://schemas.microsoft.com/office/word/2010/wordprocessingInk" xmlns:wps="http://schemas.microsoft.com/office/word/2010/wordprocessingShape" mc:Ignorable="w14 wp14">
+  <w:p>
+    <w:pPr>
+      <w:pStyle w:val="Footer"/>
+      <w:jc w:val="center"/>
+    </w:pPr>
+    <w:r>
+      <w:rPr>
+        <w:b w:val="0"/>
+        <w:i w:val="0"/>
+        <w:color w:val="808080"/>
+        <w:sz w:val="16"/>
+      </w:rPr>
+      <w:t>Nipple Crime Theme Camp  |  Com1 Slack  |  Ver 1.0  |  Confidential — Internal Use Only</w:t>
+    </w:r>
+  </w:p>
+</w:ftr>
 </file>
 
 <file path=word/numbering.xml><?xml version="1.0" encoding="utf-8"?>

</xml_diff>